<commit_message>
added notes for clarity
</commit_message>
<xml_diff>
--- a/week8_GIT/3. branching and merging.docx
+++ b/week8_GIT/3. branching and merging.docx
@@ -92,7 +92,7 @@
                     <pic:cNvPicPr/>
                   </pic:nvPicPr>
                   <pic:blipFill>
-                    <a:blip r:embed="rId5">
+                    <a:blip r:embed="rId6">
                       <a:extLst>
                         <a:ext uri="{28A0092B-C50C-407E-A947-70E740481C1C}">
                           <a14:useLocalDpi xmlns:a14="http://schemas.microsoft.com/office/drawing/2010/main" val="0"/>
@@ -170,7 +170,7 @@
                     <pic:cNvPicPr/>
                   </pic:nvPicPr>
                   <pic:blipFill>
-                    <a:blip r:embed="rId6">
+                    <a:blip r:embed="rId7">
                       <a:extLst>
                         <a:ext uri="{28A0092B-C50C-407E-A947-70E740481C1C}">
                           <a14:useLocalDpi xmlns:a14="http://schemas.microsoft.com/office/drawing/2010/main" val="0"/>
@@ -278,7 +278,7 @@
                     <pic:cNvPicPr/>
                   </pic:nvPicPr>
                   <pic:blipFill>
-                    <a:blip r:embed="rId7">
+                    <a:blip r:embed="rId8">
                       <a:extLst>
                         <a:ext uri="{28A0092B-C50C-407E-A947-70E740481C1C}">
                           <a14:useLocalDpi xmlns:a14="http://schemas.microsoft.com/office/drawing/2010/main" val="0"/>
@@ -372,7 +372,7 @@
                     <pic:cNvPicPr/>
                   </pic:nvPicPr>
                   <pic:blipFill>
-                    <a:blip r:embed="rId8">
+                    <a:blip r:embed="rId9">
                       <a:extLst>
                         <a:ext uri="{28A0092B-C50C-407E-A947-70E740481C1C}">
                           <a14:useLocalDpi xmlns:a14="http://schemas.microsoft.com/office/drawing/2010/main" val="0"/>
@@ -635,7 +635,7 @@
                     <pic:cNvPicPr/>
                   </pic:nvPicPr>
                   <pic:blipFill>
-                    <a:blip r:embed="rId9">
+                    <a:blip r:embed="rId10">
                       <a:extLst>
                         <a:ext uri="{28A0092B-C50C-407E-A947-70E740481C1C}">
                           <a14:useLocalDpi xmlns:a14="http://schemas.microsoft.com/office/drawing/2010/main" val="0"/>
@@ -696,7 +696,7 @@
           <w:lang w:val="en-US"/>
         </w:rPr>
         <w:drawing>
-          <wp:inline distT="0" distB="0" distL="0" distR="0" wp14:anchorId="0B9D75F5" wp14:editId="1823C230">
+          <wp:inline distT="0" distB="0" distL="0" distR="0" wp14:anchorId="0B9D75F5" wp14:editId="7A1AF520">
             <wp:extent cx="5731510" cy="800100"/>
             <wp:effectExtent l="0" t="0" r="2540" b="0"/>
             <wp:docPr id="586154765" name="Picture 5"/>
@@ -711,7 +711,7 @@
                     <pic:cNvPicPr/>
                   </pic:nvPicPr>
                   <pic:blipFill>
-                    <a:blip r:embed="rId10" cstate="print">
+                    <a:blip r:embed="rId11" cstate="print">
                       <a:extLst>
                         <a:ext uri="{28A0092B-C50C-407E-A947-70E740481C1C}">
                           <a14:useLocalDpi xmlns:a14="http://schemas.microsoft.com/office/drawing/2010/main" val="0"/>
@@ -780,11 +780,19 @@
           <w:lang w:val="en-US"/>
         </w:rPr>
       </w:pPr>
-      <w:r>
-        <w:rPr>
-          <w:lang w:val="en-US"/>
-        </w:rPr>
-        <w:t xml:space="preserve">NewBranch is merged </w:t>
+      <w:proofErr w:type="spellStart"/>
+      <w:r>
+        <w:rPr>
+          <w:lang w:val="en-US"/>
+        </w:rPr>
+        <w:t>NewBranch</w:t>
+      </w:r>
+      <w:proofErr w:type="spellEnd"/>
+      <w:r>
+        <w:rPr>
+          <w:lang w:val="en-US"/>
+        </w:rPr>
+        <w:t xml:space="preserve"> is merged </w:t>
       </w:r>
       <w:proofErr w:type="gramStart"/>
       <w:r>
@@ -813,11 +821,19 @@
           <w:lang w:val="en-US"/>
         </w:rPr>
       </w:pPr>
-      <w:r>
-        <w:rPr>
-          <w:lang w:val="en-US"/>
-        </w:rPr>
-        <w:t>NewBranch deleted</w:t>
+      <w:proofErr w:type="spellStart"/>
+      <w:r>
+        <w:rPr>
+          <w:lang w:val="en-US"/>
+        </w:rPr>
+        <w:t>NewBranch</w:t>
+      </w:r>
+      <w:proofErr w:type="spellEnd"/>
+      <w:r>
+        <w:rPr>
+          <w:lang w:val="en-US"/>
+        </w:rPr>
+        <w:t xml:space="preserve"> deleted</w:t>
       </w:r>
     </w:p>
     <w:p>
@@ -854,7 +870,7 @@
                     <pic:cNvPicPr/>
                   </pic:nvPicPr>
                   <pic:blipFill>
-                    <a:blip r:embed="rId11">
+                    <a:blip r:embed="rId12">
                       <a:extLst>
                         <a:ext uri="{28A0092B-C50C-407E-A947-70E740481C1C}">
                           <a14:useLocalDpi xmlns:a14="http://schemas.microsoft.com/office/drawing/2010/main" val="0"/>
@@ -913,6 +929,1023 @@
         </w:rPr>
       </w:pPr>
     </w:p>
+    <w:p>
+      <w:pPr>
+        <w:jc w:val="center"/>
+        <w:rPr>
+          <w:lang w:val="en-US"/>
+        </w:rPr>
+      </w:pPr>
+    </w:p>
+    <w:p>
+      <w:pPr>
+        <w:jc w:val="center"/>
+        <w:rPr>
+          <w:lang w:val="en-US"/>
+        </w:rPr>
+      </w:pPr>
+    </w:p>
+    <w:p>
+      <w:pPr>
+        <w:jc w:val="center"/>
+        <w:rPr>
+          <w:lang w:val="en-US"/>
+        </w:rPr>
+      </w:pPr>
+    </w:p>
+    <w:p>
+      <w:pPr>
+        <w:rPr>
+          <w:b/>
+          <w:bCs/>
+          <w:u w:val="single"/>
+          <w:lang w:val="en-US"/>
+        </w:rPr>
+      </w:pPr>
+      <w:r>
+        <w:rPr>
+          <w:b/>
+          <w:bCs/>
+          <w:u w:val="single"/>
+          <w:lang w:val="en-US"/>
+        </w:rPr>
+        <w:lastRenderedPageBreak/>
+        <w:t>Summary of some important commands:</w:t>
+      </w:r>
+    </w:p>
+    <w:p>
+      <w:pPr>
+        <w:pStyle w:val="ListParagraph"/>
+        <w:numPr>
+          <w:ilvl w:val="0"/>
+          <w:numId w:val="3"/>
+        </w:numPr>
+        <w:rPr>
+          <w:b/>
+          <w:bCs/>
+          <w:u w:val="single"/>
+          <w:lang w:val="en-US"/>
+        </w:rPr>
+      </w:pPr>
+      <w:r>
+        <w:rPr>
+          <w:lang w:val="en-US"/>
+        </w:rPr>
+        <w:t>git diff branch1 branch2</w:t>
+      </w:r>
+      <w:r>
+        <w:rPr>
+          <w:lang w:val="en-US"/>
+        </w:rPr>
+        <w:t>:</w:t>
+      </w:r>
+    </w:p>
+    <w:p>
+      <w:pPr>
+        <w:pStyle w:val="ListParagraph"/>
+        <w:numPr>
+          <w:ilvl w:val="1"/>
+          <w:numId w:val="3"/>
+        </w:numPr>
+        <w:rPr>
+          <w:lang w:val="en-US"/>
+        </w:rPr>
+      </w:pPr>
+      <w:r>
+        <w:t>Shows the difference in file content between two branches — branch1 and branch2.</w:t>
+      </w:r>
+    </w:p>
+    <w:p>
+      <w:pPr>
+        <w:pStyle w:val="ListParagraph"/>
+        <w:numPr>
+          <w:ilvl w:val="1"/>
+          <w:numId w:val="3"/>
+        </w:numPr>
+      </w:pPr>
+      <w:r>
+        <w:t xml:space="preserve">This </w:t>
+      </w:r>
+      <w:r>
+        <w:rPr>
+          <w:b/>
+          <w:bCs/>
+        </w:rPr>
+        <w:t>compares</w:t>
+      </w:r>
+      <w:r>
+        <w:t xml:space="preserve"> branch1 and branch2.</w:t>
+      </w:r>
+    </w:p>
+    <w:p>
+      <w:pPr>
+        <w:pStyle w:val="ListParagraph"/>
+        <w:numPr>
+          <w:ilvl w:val="1"/>
+          <w:numId w:val="3"/>
+        </w:numPr>
+      </w:pPr>
+      <w:r>
+        <w:t xml:space="preserve">The output shows changes </w:t>
+      </w:r>
+      <w:r>
+        <w:rPr>
+          <w:b/>
+          <w:bCs/>
+        </w:rPr>
+        <w:t>needed to go from branch1 → branch2</w:t>
+      </w:r>
+    </w:p>
+    <w:p>
+      <w:pPr>
+        <w:pStyle w:val="ListParagraph"/>
+        <w:numPr>
+          <w:ilvl w:val="1"/>
+          <w:numId w:val="3"/>
+        </w:numPr>
+      </w:pPr>
+      <w:r>
+        <w:t>If you see a line with +, it exists in branch2 but not in branch1.</w:t>
+      </w:r>
+    </w:p>
+    <w:p>
+      <w:pPr>
+        <w:pStyle w:val="ListParagraph"/>
+        <w:numPr>
+          <w:ilvl w:val="1"/>
+          <w:numId w:val="3"/>
+        </w:numPr>
+      </w:pPr>
+      <w:r>
+        <w:t>If you see a line with -, it exists in branch1 but not in branch</w:t>
+      </w:r>
+      <w:r>
+        <w:t>2.</w:t>
+      </w:r>
+    </w:p>
+    <w:p>
+      <w:pPr>
+        <w:pStyle w:val="ListParagraph"/>
+        <w:numPr>
+          <w:ilvl w:val="1"/>
+          <w:numId w:val="3"/>
+        </w:numPr>
+      </w:pPr>
+      <w:r>
+        <w:t>USEFUL BEFORE MERGING BRANCHES TO CHECK.</w:t>
+      </w:r>
+      <w:r>
+        <w:rPr>
+          <w:noProof/>
+        </w:rPr>
+        <w:drawing>
+          <wp:inline distT="0" distB="0" distL="0" distR="0" wp14:anchorId="676B5561" wp14:editId="64421C54">
+            <wp:extent cx="5544324" cy="2267266"/>
+            <wp:effectExtent l="0" t="0" r="0" b="0"/>
+            <wp:docPr id="400406601" name="Picture 1"/>
+            <wp:cNvGraphicFramePr>
+              <a:graphicFrameLocks xmlns:a="http://schemas.openxmlformats.org/drawingml/2006/main" noChangeAspect="1"/>
+            </wp:cNvGraphicFramePr>
+            <a:graphic xmlns:a="http://schemas.openxmlformats.org/drawingml/2006/main">
+              <a:graphicData uri="http://schemas.openxmlformats.org/drawingml/2006/picture">
+                <pic:pic xmlns:pic="http://schemas.openxmlformats.org/drawingml/2006/picture">
+                  <pic:nvPicPr>
+                    <pic:cNvPr id="400406601" name="Picture 400406601"/>
+                    <pic:cNvPicPr/>
+                  </pic:nvPicPr>
+                  <pic:blipFill>
+                    <a:blip r:embed="rId13">
+                      <a:extLst>
+                        <a:ext uri="{28A0092B-C50C-407E-A947-70E740481C1C}">
+                          <a14:useLocalDpi xmlns:a14="http://schemas.microsoft.com/office/drawing/2010/main" val="0"/>
+                        </a:ext>
+                      </a:extLst>
+                    </a:blip>
+                    <a:stretch>
+                      <a:fillRect/>
+                    </a:stretch>
+                  </pic:blipFill>
+                  <pic:spPr>
+                    <a:xfrm>
+                      <a:off x="0" y="0"/>
+                      <a:ext cx="5544324" cy="2267266"/>
+                    </a:xfrm>
+                    <a:prstGeom prst="rect">
+                      <a:avLst/>
+                    </a:prstGeom>
+                  </pic:spPr>
+                </pic:pic>
+              </a:graphicData>
+            </a:graphic>
+          </wp:inline>
+        </w:drawing>
+      </w:r>
+    </w:p>
+    <w:p>
+      <w:pPr>
+        <w:ind w:left="1080"/>
+        <w:rPr>
+          <w:b/>
+          <w:bCs/>
+          <w:u w:val="single"/>
+        </w:rPr>
+      </w:pPr>
+      <w:r>
+        <w:rPr>
+          <w:b/>
+          <w:bCs/>
+          <w:u w:val="single"/>
+        </w:rPr>
+        <w:t>Output understanding:</w:t>
+      </w:r>
+    </w:p>
+    <w:p>
+      <w:pPr>
+        <w:pStyle w:val="ListParagraph"/>
+        <w:numPr>
+          <w:ilvl w:val="0"/>
+          <w:numId w:val="6"/>
+        </w:numPr>
+      </w:pPr>
+      <w:r>
+        <w:t>diff --git a/newfile.txt b/newfile.txt</w:t>
+      </w:r>
+    </w:p>
+    <w:p>
+      <w:pPr>
+        <w:pStyle w:val="ListParagraph"/>
+        <w:numPr>
+          <w:ilvl w:val="1"/>
+          <w:numId w:val="6"/>
+        </w:numPr>
+      </w:pPr>
+      <w:r>
+        <w:t xml:space="preserve">Git is comparing the file newfile.txt as it appears in main (a/) vs. in </w:t>
+      </w:r>
+      <w:proofErr w:type="spellStart"/>
+      <w:r>
+        <w:t>NewBranch</w:t>
+      </w:r>
+      <w:proofErr w:type="spellEnd"/>
+      <w:r>
+        <w:t xml:space="preserve"> (b/).</w:t>
+      </w:r>
+    </w:p>
+    <w:p>
+      <w:pPr>
+        <w:pStyle w:val="ListParagraph"/>
+        <w:numPr>
+          <w:ilvl w:val="1"/>
+          <w:numId w:val="6"/>
+        </w:numPr>
+      </w:pPr>
+      <w:r>
+        <w:t xml:space="preserve">Since this file doesn’t exist in main, it’s treated as a </w:t>
+      </w:r>
+      <w:r>
+        <w:rPr>
+          <w:b/>
+          <w:bCs/>
+        </w:rPr>
+        <w:t>new file</w:t>
+      </w:r>
+      <w:r>
+        <w:t xml:space="preserve"> in </w:t>
+      </w:r>
+      <w:proofErr w:type="spellStart"/>
+      <w:r>
+        <w:t>NewBranch</w:t>
+      </w:r>
+      <w:proofErr w:type="spellEnd"/>
+      <w:r>
+        <w:t>.</w:t>
+      </w:r>
+    </w:p>
+    <w:p>
+      <w:pPr>
+        <w:pStyle w:val="ListParagraph"/>
+        <w:numPr>
+          <w:ilvl w:val="0"/>
+          <w:numId w:val="6"/>
+        </w:numPr>
+      </w:pPr>
+      <w:r>
+        <w:t>new file mode 100644</w:t>
+      </w:r>
+    </w:p>
+    <w:p>
+      <w:pPr>
+        <w:numPr>
+          <w:ilvl w:val="1"/>
+          <w:numId w:val="6"/>
+        </w:numPr>
+        <w:spacing w:before="100" w:beforeAutospacing="1" w:after="100" w:afterAutospacing="1" w:line="240" w:lineRule="auto"/>
+        <w:rPr>
+          <w:rFonts w:ascii="Times New Roman" w:eastAsia="Times New Roman" w:hAnsi="Times New Roman" w:cs="Times New Roman"/>
+          <w:kern w:val="0"/>
+          <w:lang w:eastAsia="en-IN"/>
+          <w14:ligatures w14:val="none"/>
+        </w:rPr>
+      </w:pPr>
+      <w:r>
+        <w:rPr>
+          <w:rFonts w:ascii="Times New Roman" w:eastAsia="Times New Roman" w:hAnsi="Times New Roman" w:cs="Times New Roman"/>
+          <w:kern w:val="0"/>
+          <w:lang w:eastAsia="en-IN"/>
+          <w14:ligatures w14:val="none"/>
+        </w:rPr>
+        <w:t xml:space="preserve">This confirms: </w:t>
+      </w:r>
+      <w:r>
+        <w:rPr>
+          <w:rFonts w:ascii="Times New Roman" w:eastAsia="Times New Roman" w:hAnsi="Times New Roman" w:cs="Times New Roman"/>
+          <w:b/>
+          <w:bCs/>
+          <w:kern w:val="0"/>
+          <w:lang w:eastAsia="en-IN"/>
+          <w14:ligatures w14:val="none"/>
+        </w:rPr>
+        <w:t>a new file was created</w:t>
+      </w:r>
+      <w:r>
+        <w:rPr>
+          <w:rFonts w:ascii="Times New Roman" w:eastAsia="Times New Roman" w:hAnsi="Times New Roman" w:cs="Times New Roman"/>
+          <w:kern w:val="0"/>
+          <w:lang w:eastAsia="en-IN"/>
+          <w14:ligatures w14:val="none"/>
+        </w:rPr>
+        <w:t>.</w:t>
+      </w:r>
+    </w:p>
+    <w:p>
+      <w:pPr>
+        <w:numPr>
+          <w:ilvl w:val="1"/>
+          <w:numId w:val="6"/>
+        </w:numPr>
+        <w:spacing w:before="100" w:beforeAutospacing="1" w:after="100" w:afterAutospacing="1" w:line="240" w:lineRule="auto"/>
+        <w:rPr>
+          <w:rFonts w:ascii="Times New Roman" w:eastAsia="Times New Roman" w:hAnsi="Times New Roman" w:cs="Times New Roman"/>
+          <w:kern w:val="0"/>
+          <w:lang w:eastAsia="en-IN"/>
+          <w14:ligatures w14:val="none"/>
+        </w:rPr>
+      </w:pPr>
+      <w:r>
+        <w:rPr>
+          <w:rFonts w:ascii="Courier New" w:eastAsia="Times New Roman" w:hAnsi="Courier New" w:cs="Courier New"/>
+          <w:kern w:val="0"/>
+          <w:sz w:val="20"/>
+          <w:szCs w:val="20"/>
+          <w:lang w:eastAsia="en-IN"/>
+          <w14:ligatures w14:val="none"/>
+        </w:rPr>
+        <w:t>100644</w:t>
+      </w:r>
+      <w:r>
+        <w:rPr>
+          <w:rFonts w:ascii="Times New Roman" w:eastAsia="Times New Roman" w:hAnsi="Times New Roman" w:cs="Times New Roman"/>
+          <w:kern w:val="0"/>
+          <w:lang w:eastAsia="en-IN"/>
+          <w14:ligatures w14:val="none"/>
+        </w:rPr>
+        <w:t xml:space="preserve"> is the standard file permission for a normal, non-executable file.</w:t>
+      </w:r>
+    </w:p>
+    <w:p>
+      <w:pPr>
+        <w:numPr>
+          <w:ilvl w:val="0"/>
+          <w:numId w:val="6"/>
+        </w:numPr>
+        <w:spacing w:before="100" w:beforeAutospacing="1" w:after="100" w:afterAutospacing="1" w:line="240" w:lineRule="auto"/>
+        <w:rPr>
+          <w:rFonts w:ascii="Times New Roman" w:eastAsia="Times New Roman" w:hAnsi="Times New Roman" w:cs="Times New Roman"/>
+          <w:kern w:val="0"/>
+          <w:lang w:eastAsia="en-IN"/>
+          <w14:ligatures w14:val="none"/>
+        </w:rPr>
+      </w:pPr>
+      <w:r>
+        <w:rPr>
+          <w:rFonts w:ascii="Times New Roman" w:eastAsia="Times New Roman" w:hAnsi="Times New Roman" w:cs="Times New Roman"/>
+          <w:kern w:val="0"/>
+          <w:lang w:eastAsia="en-IN"/>
+          <w14:ligatures w14:val="none"/>
+        </w:rPr>
+        <w:t>Index 000000. .4056526</w:t>
+      </w:r>
+    </w:p>
+    <w:p>
+      <w:pPr>
+        <w:numPr>
+          <w:ilvl w:val="1"/>
+          <w:numId w:val="6"/>
+        </w:numPr>
+        <w:spacing w:before="100" w:beforeAutospacing="1" w:after="100" w:afterAutospacing="1" w:line="240" w:lineRule="auto"/>
+        <w:rPr>
+          <w:rFonts w:ascii="Times New Roman" w:eastAsia="Times New Roman" w:hAnsi="Times New Roman" w:cs="Times New Roman"/>
+          <w:kern w:val="0"/>
+          <w:lang w:eastAsia="en-IN"/>
+          <w14:ligatures w14:val="none"/>
+        </w:rPr>
+      </w:pPr>
+      <w:r>
+        <w:rPr>
+          <w:rFonts w:ascii="Times New Roman" w:eastAsia="Times New Roman" w:hAnsi="Times New Roman" w:cs="Times New Roman"/>
+          <w:kern w:val="0"/>
+          <w:lang w:eastAsia="en-IN"/>
+          <w14:ligatures w14:val="none"/>
+        </w:rPr>
+        <w:t>Git blob hashes showing:</w:t>
+      </w:r>
+    </w:p>
+    <w:p>
+      <w:pPr>
+        <w:numPr>
+          <w:ilvl w:val="1"/>
+          <w:numId w:val="6"/>
+        </w:numPr>
+        <w:spacing w:before="100" w:beforeAutospacing="1" w:after="100" w:afterAutospacing="1" w:line="240" w:lineRule="auto"/>
+        <w:rPr>
+          <w:rFonts w:ascii="Times New Roman" w:eastAsia="Times New Roman" w:hAnsi="Times New Roman" w:cs="Times New Roman"/>
+          <w:kern w:val="0"/>
+          <w:lang w:eastAsia="en-IN"/>
+          <w14:ligatures w14:val="none"/>
+        </w:rPr>
+      </w:pPr>
+      <w:r>
+        <w:rPr>
+          <w:rFonts w:ascii="Courier New" w:eastAsia="Times New Roman" w:hAnsi="Courier New" w:cs="Courier New"/>
+          <w:kern w:val="0"/>
+          <w:sz w:val="20"/>
+          <w:szCs w:val="20"/>
+          <w:lang w:eastAsia="en-IN"/>
+          <w14:ligatures w14:val="none"/>
+        </w:rPr>
+        <w:t>0000000</w:t>
+      </w:r>
+      <w:r>
+        <w:rPr>
+          <w:rFonts w:ascii="Times New Roman" w:eastAsia="Times New Roman" w:hAnsi="Times New Roman" w:cs="Times New Roman"/>
+          <w:kern w:val="0"/>
+          <w:lang w:eastAsia="en-IN"/>
+          <w14:ligatures w14:val="none"/>
+        </w:rPr>
+        <w:t xml:space="preserve">: the file </w:t>
+      </w:r>
+      <w:r>
+        <w:rPr>
+          <w:rFonts w:ascii="Times New Roman" w:eastAsia="Times New Roman" w:hAnsi="Times New Roman" w:cs="Times New Roman"/>
+          <w:b/>
+          <w:bCs/>
+          <w:kern w:val="0"/>
+          <w:lang w:eastAsia="en-IN"/>
+          <w14:ligatures w14:val="none"/>
+        </w:rPr>
+        <w:t>did not exist</w:t>
+      </w:r>
+      <w:r>
+        <w:rPr>
+          <w:rFonts w:ascii="Times New Roman" w:eastAsia="Times New Roman" w:hAnsi="Times New Roman" w:cs="Times New Roman"/>
+          <w:kern w:val="0"/>
+          <w:lang w:eastAsia="en-IN"/>
+          <w14:ligatures w14:val="none"/>
+        </w:rPr>
+        <w:t xml:space="preserve"> before (i.e., in </w:t>
+      </w:r>
+      <w:r>
+        <w:rPr>
+          <w:rFonts w:ascii="Courier New" w:eastAsia="Times New Roman" w:hAnsi="Courier New" w:cs="Courier New"/>
+          <w:kern w:val="0"/>
+          <w:sz w:val="20"/>
+          <w:szCs w:val="20"/>
+          <w:lang w:eastAsia="en-IN"/>
+          <w14:ligatures w14:val="none"/>
+        </w:rPr>
+        <w:t>main</w:t>
+      </w:r>
+      <w:r>
+        <w:rPr>
+          <w:rFonts w:ascii="Times New Roman" w:eastAsia="Times New Roman" w:hAnsi="Times New Roman" w:cs="Times New Roman"/>
+          <w:kern w:val="0"/>
+          <w:lang w:eastAsia="en-IN"/>
+          <w14:ligatures w14:val="none"/>
+        </w:rPr>
+        <w:t>)</w:t>
+      </w:r>
+    </w:p>
+    <w:p>
+      <w:pPr>
+        <w:numPr>
+          <w:ilvl w:val="1"/>
+          <w:numId w:val="6"/>
+        </w:numPr>
+        <w:spacing w:before="100" w:beforeAutospacing="1" w:after="100" w:afterAutospacing="1" w:line="240" w:lineRule="auto"/>
+        <w:rPr>
+          <w:rFonts w:ascii="Times New Roman" w:eastAsia="Times New Roman" w:hAnsi="Times New Roman" w:cs="Times New Roman"/>
+          <w:kern w:val="0"/>
+          <w:lang w:eastAsia="en-IN"/>
+          <w14:ligatures w14:val="none"/>
+        </w:rPr>
+      </w:pPr>
+      <w:r>
+        <w:rPr>
+          <w:rFonts w:ascii="Courier New" w:eastAsia="Times New Roman" w:hAnsi="Courier New" w:cs="Courier New"/>
+          <w:kern w:val="0"/>
+          <w:sz w:val="20"/>
+          <w:szCs w:val="20"/>
+          <w:lang w:eastAsia="en-IN"/>
+          <w14:ligatures w14:val="none"/>
+        </w:rPr>
+        <w:t>4056526</w:t>
+      </w:r>
+      <w:r>
+        <w:rPr>
+          <w:rFonts w:ascii="Times New Roman" w:eastAsia="Times New Roman" w:hAnsi="Times New Roman" w:cs="Times New Roman"/>
+          <w:kern w:val="0"/>
+          <w:lang w:eastAsia="en-IN"/>
+          <w14:ligatures w14:val="none"/>
+        </w:rPr>
+        <w:t xml:space="preserve">: the hash of the new file’s content in </w:t>
+      </w:r>
+      <w:proofErr w:type="spellStart"/>
+      <w:r>
+        <w:rPr>
+          <w:rFonts w:ascii="Courier New" w:eastAsia="Times New Roman" w:hAnsi="Courier New" w:cs="Courier New"/>
+          <w:kern w:val="0"/>
+          <w:sz w:val="20"/>
+          <w:szCs w:val="20"/>
+          <w:lang w:eastAsia="en-IN"/>
+          <w14:ligatures w14:val="none"/>
+        </w:rPr>
+        <w:t>NewBranch</w:t>
+      </w:r>
+      <w:proofErr w:type="spellEnd"/>
+    </w:p>
+    <w:p>
+      <w:pPr>
+        <w:pStyle w:val="ListParagraph"/>
+        <w:numPr>
+          <w:ilvl w:val="0"/>
+          <w:numId w:val="6"/>
+        </w:numPr>
+        <w:spacing w:before="100" w:beforeAutospacing="1" w:after="100" w:afterAutospacing="1" w:line="240" w:lineRule="auto"/>
+        <w:rPr>
+          <w:rFonts w:ascii="Times New Roman" w:eastAsia="Times New Roman" w:hAnsi="Times New Roman" w:cs="Times New Roman"/>
+          <w:kern w:val="0"/>
+          <w:lang w:eastAsia="en-IN"/>
+          <w14:ligatures w14:val="none"/>
+        </w:rPr>
+      </w:pPr>
+    </w:p>
+    <w:tbl>
+      <w:tblPr>
+        <w:tblW w:w="0" w:type="auto"/>
+        <w:tblCellSpacing w:w="15" w:type="dxa"/>
+        <w:tblCellMar>
+          <w:top w:w="15" w:type="dxa"/>
+          <w:left w:w="15" w:type="dxa"/>
+          <w:bottom w:w="15" w:type="dxa"/>
+          <w:right w:w="15" w:type="dxa"/>
+        </w:tblCellMar>
+        <w:tblLook w:val="04A0" w:firstRow="1" w:lastRow="0" w:firstColumn="1" w:lastColumn="0" w:noHBand="0" w:noVBand="1"/>
+      </w:tblPr>
+      <w:tblGrid>
+        <w:gridCol w:w="1560"/>
+        <w:gridCol w:w="7466"/>
+      </w:tblGrid>
+      <w:tr>
+        <w:trPr>
+          <w:tblHeader/>
+          <w:tblCellSpacing w:w="15" w:type="dxa"/>
+        </w:trPr>
+        <w:tc>
+          <w:tcPr>
+            <w:tcW w:w="1515" w:type="dxa"/>
+            <w:vAlign w:val="center"/>
+            <w:hideMark/>
+          </w:tcPr>
+          <w:p>
+            <w:pPr>
+              <w:rPr>
+                <w:b/>
+                <w:bCs/>
+              </w:rPr>
+            </w:pPr>
+            <w:r>
+              <w:rPr>
+                <w:b/>
+                <w:bCs/>
+              </w:rPr>
+              <w:t>Part</w:t>
+            </w:r>
+          </w:p>
+        </w:tc>
+        <w:tc>
+          <w:tcPr>
+            <w:tcW w:w="7421" w:type="dxa"/>
+            <w:vAlign w:val="center"/>
+            <w:hideMark/>
+          </w:tcPr>
+          <w:p>
+            <w:pPr>
+              <w:rPr>
+                <w:b/>
+                <w:bCs/>
+              </w:rPr>
+            </w:pPr>
+            <w:r>
+              <w:rPr>
+                <w:b/>
+                <w:bCs/>
+              </w:rPr>
+              <w:t>Meaning</w:t>
+            </w:r>
+          </w:p>
+        </w:tc>
+      </w:tr>
+      <w:tr>
+        <w:trPr>
+          <w:tblCellSpacing w:w="15" w:type="dxa"/>
+        </w:trPr>
+        <w:tc>
+          <w:tcPr>
+            <w:tcW w:w="1515" w:type="dxa"/>
+            <w:vAlign w:val="center"/>
+            <w:hideMark/>
+          </w:tcPr>
+          <w:p>
+            <w:r>
+              <w:t>-0,0</w:t>
+            </w:r>
+          </w:p>
+        </w:tc>
+        <w:tc>
+          <w:tcPr>
+            <w:tcW w:w="7421" w:type="dxa"/>
+            <w:vAlign w:val="center"/>
+            <w:hideMark/>
+          </w:tcPr>
+          <w:p>
+            <w:r>
+              <w:t xml:space="preserve">In the </w:t>
+            </w:r>
+            <w:r>
+              <w:rPr>
+                <w:b/>
+                <w:bCs/>
+              </w:rPr>
+              <w:t>original file</w:t>
+            </w:r>
+            <w:r>
+              <w:t xml:space="preserve"> (from main), start at line 0, and 0 lines are affected. (The file doesn’t exist!)</w:t>
+            </w:r>
+          </w:p>
+        </w:tc>
+      </w:tr>
+      <w:tr>
+        <w:trPr>
+          <w:tblCellSpacing w:w="15" w:type="dxa"/>
+        </w:trPr>
+        <w:tc>
+          <w:tcPr>
+            <w:tcW w:w="1515" w:type="dxa"/>
+            <w:vAlign w:val="center"/>
+            <w:hideMark/>
+          </w:tcPr>
+          <w:p>
+            <w:r>
+              <w:lastRenderedPageBreak/>
+              <w:t>+1</w:t>
+            </w:r>
+          </w:p>
+        </w:tc>
+        <w:tc>
+          <w:tcPr>
+            <w:tcW w:w="7421" w:type="dxa"/>
+            <w:vAlign w:val="center"/>
+            <w:hideMark/>
+          </w:tcPr>
+          <w:p>
+            <w:r>
+              <w:t xml:space="preserve">In the </w:t>
+            </w:r>
+            <w:r>
+              <w:rPr>
+                <w:b/>
+                <w:bCs/>
+              </w:rPr>
+              <w:t>new file</w:t>
+            </w:r>
+            <w:r>
+              <w:t xml:space="preserve"> (in </w:t>
+            </w:r>
+            <w:proofErr w:type="spellStart"/>
+            <w:r>
+              <w:t>NewBranch</w:t>
+            </w:r>
+            <w:proofErr w:type="spellEnd"/>
+            <w:r>
+              <w:t>), start at line 1, and 1 line is added.</w:t>
+            </w:r>
+          </w:p>
+        </w:tc>
+      </w:tr>
+      <w:tr>
+        <w:trPr>
+          <w:tblCellSpacing w:w="15" w:type="dxa"/>
+        </w:trPr>
+        <w:tc>
+          <w:tcPr>
+            <w:tcW w:w="1515" w:type="dxa"/>
+            <w:vAlign w:val="center"/>
+            <w:hideMark/>
+          </w:tcPr>
+          <w:p>
+            <w:r>
+              <w:t>@@</w:t>
+            </w:r>
+          </w:p>
+        </w:tc>
+        <w:tc>
+          <w:tcPr>
+            <w:tcW w:w="7421" w:type="dxa"/>
+            <w:vAlign w:val="center"/>
+            <w:hideMark/>
+          </w:tcPr>
+          <w:p>
+            <w:r>
+              <w:t>Just a marker to show the start and end of a change "chunk".</w:t>
+            </w:r>
+          </w:p>
+        </w:tc>
+      </w:tr>
+    </w:tbl>
+    <w:p/>
+    <w:p>
+      <w:r>
+        <w:rPr>
+          <w:noProof/>
+        </w:rPr>
+        <w:drawing>
+          <wp:inline distT="0" distB="0" distL="0" distR="0" wp14:anchorId="38D97493" wp14:editId="64552B10">
+            <wp:extent cx="5731510" cy="1191895"/>
+            <wp:effectExtent l="0" t="0" r="2540" b="8255"/>
+            <wp:docPr id="335882977" name="Picture 2"/>
+            <wp:cNvGraphicFramePr>
+              <a:graphicFrameLocks xmlns:a="http://schemas.openxmlformats.org/drawingml/2006/main" noChangeAspect="1"/>
+            </wp:cNvGraphicFramePr>
+            <a:graphic xmlns:a="http://schemas.openxmlformats.org/drawingml/2006/main">
+              <a:graphicData uri="http://schemas.openxmlformats.org/drawingml/2006/picture">
+                <pic:pic xmlns:pic="http://schemas.openxmlformats.org/drawingml/2006/picture">
+                  <pic:nvPicPr>
+                    <pic:cNvPr id="335882977" name="Picture 335882977"/>
+                    <pic:cNvPicPr/>
+                  </pic:nvPicPr>
+                  <pic:blipFill>
+                    <a:blip r:embed="rId14">
+                      <a:extLst>
+                        <a:ext uri="{28A0092B-C50C-407E-A947-70E740481C1C}">
+                          <a14:useLocalDpi xmlns:a14="http://schemas.microsoft.com/office/drawing/2010/main" val="0"/>
+                        </a:ext>
+                      </a:extLst>
+                    </a:blip>
+                    <a:stretch>
+                      <a:fillRect/>
+                    </a:stretch>
+                  </pic:blipFill>
+                  <pic:spPr>
+                    <a:xfrm>
+                      <a:off x="0" y="0"/>
+                      <a:ext cx="5731510" cy="1191895"/>
+                    </a:xfrm>
+                    <a:prstGeom prst="rect">
+                      <a:avLst/>
+                    </a:prstGeom>
+                  </pic:spPr>
+                </pic:pic>
+              </a:graphicData>
+            </a:graphic>
+          </wp:inline>
+        </w:drawing>
+      </w:r>
+    </w:p>
+    <w:tbl>
+      <w:tblPr>
+        <w:tblW w:w="0" w:type="auto"/>
+        <w:tblCellSpacing w:w="15" w:type="dxa"/>
+        <w:tblCellMar>
+          <w:top w:w="15" w:type="dxa"/>
+          <w:left w:w="15" w:type="dxa"/>
+          <w:bottom w:w="15" w:type="dxa"/>
+          <w:right w:w="15" w:type="dxa"/>
+        </w:tblCellMar>
+        <w:tblLook w:val="04A0" w:firstRow="1" w:lastRow="0" w:firstColumn="1" w:lastColumn="0" w:noHBand="0" w:noVBand="1"/>
+      </w:tblPr>
+      <w:tblGrid>
+        <w:gridCol w:w="1083"/>
+        <w:gridCol w:w="5933"/>
+      </w:tblGrid>
+      <w:tr>
+        <w:trPr>
+          <w:tblHeader/>
+          <w:tblCellSpacing w:w="15" w:type="dxa"/>
+        </w:trPr>
+        <w:tc>
+          <w:tcPr>
+            <w:tcW w:w="0" w:type="auto"/>
+            <w:vAlign w:val="center"/>
+            <w:hideMark/>
+          </w:tcPr>
+          <w:p>
+            <w:pPr>
+              <w:rPr>
+                <w:b/>
+                <w:bCs/>
+              </w:rPr>
+            </w:pPr>
+            <w:r>
+              <w:rPr>
+                <w:b/>
+                <w:bCs/>
+              </w:rPr>
+              <w:t>Part</w:t>
+            </w:r>
+          </w:p>
+        </w:tc>
+        <w:tc>
+          <w:tcPr>
+            <w:tcW w:w="0" w:type="auto"/>
+            <w:vAlign w:val="center"/>
+            <w:hideMark/>
+          </w:tcPr>
+          <w:p>
+            <w:pPr>
+              <w:rPr>
+                <w:b/>
+                <w:bCs/>
+              </w:rPr>
+            </w:pPr>
+            <w:r>
+              <w:rPr>
+                <w:b/>
+                <w:bCs/>
+              </w:rPr>
+              <w:t>Meaning</w:t>
+            </w:r>
+          </w:p>
+        </w:tc>
+      </w:tr>
+      <w:tr>
+        <w:trPr>
+          <w:tblCellSpacing w:w="15" w:type="dxa"/>
+        </w:trPr>
+        <w:tc>
+          <w:tcPr>
+            <w:tcW w:w="0" w:type="auto"/>
+            <w:vAlign w:val="center"/>
+            <w:hideMark/>
+          </w:tcPr>
+          <w:p>
+            <w:r>
+              <w:t>git log</w:t>
+            </w:r>
+          </w:p>
+        </w:tc>
+        <w:tc>
+          <w:tcPr>
+            <w:tcW w:w="0" w:type="auto"/>
+            <w:vAlign w:val="center"/>
+            <w:hideMark/>
+          </w:tcPr>
+          <w:p>
+            <w:r>
+              <w:t>Shows commit history</w:t>
+            </w:r>
+          </w:p>
+        </w:tc>
+      </w:tr>
+      <w:tr>
+        <w:trPr>
+          <w:tblCellSpacing w:w="15" w:type="dxa"/>
+        </w:trPr>
+        <w:tc>
+          <w:tcPr>
+            <w:tcW w:w="0" w:type="auto"/>
+            <w:vAlign w:val="center"/>
+            <w:hideMark/>
+          </w:tcPr>
+          <w:p>
+            <w:r>
+              <w:t>--</w:t>
+            </w:r>
+            <w:proofErr w:type="spellStart"/>
+            <w:r>
+              <w:t>oneline</w:t>
+            </w:r>
+            <w:proofErr w:type="spellEnd"/>
+          </w:p>
+        </w:tc>
+        <w:tc>
+          <w:tcPr>
+            <w:tcW w:w="0" w:type="auto"/>
+            <w:vAlign w:val="center"/>
+            <w:hideMark/>
+          </w:tcPr>
+          <w:p>
+            <w:r>
+              <w:t>Shows each commit in a single short line</w:t>
+            </w:r>
+          </w:p>
+        </w:tc>
+      </w:tr>
+      <w:tr>
+        <w:trPr>
+          <w:tblCellSpacing w:w="15" w:type="dxa"/>
+        </w:trPr>
+        <w:tc>
+          <w:tcPr>
+            <w:tcW w:w="0" w:type="auto"/>
+            <w:vAlign w:val="center"/>
+            <w:hideMark/>
+          </w:tcPr>
+          <w:p>
+            <w:r>
+              <w:t>--graph</w:t>
+            </w:r>
+          </w:p>
+        </w:tc>
+        <w:tc>
+          <w:tcPr>
+            <w:tcW w:w="0" w:type="auto"/>
+            <w:vAlign w:val="center"/>
+            <w:hideMark/>
+          </w:tcPr>
+          <w:p>
+            <w:r>
+              <w:t>Draws an ASCII graph showing branches and merges</w:t>
+            </w:r>
+          </w:p>
+        </w:tc>
+      </w:tr>
+      <w:tr>
+        <w:trPr>
+          <w:tblCellSpacing w:w="15" w:type="dxa"/>
+        </w:trPr>
+        <w:tc>
+          <w:tcPr>
+            <w:tcW w:w="0" w:type="auto"/>
+            <w:vAlign w:val="center"/>
+            <w:hideMark/>
+          </w:tcPr>
+          <w:p>
+            <w:r>
+              <w:t>--decorate</w:t>
+            </w:r>
+          </w:p>
+        </w:tc>
+        <w:tc>
+          <w:tcPr>
+            <w:tcW w:w="0" w:type="auto"/>
+            <w:vAlign w:val="center"/>
+            <w:hideMark/>
+          </w:tcPr>
+          <w:p>
+            <w:r>
+              <w:t>Shows names of branches, tags, HEAD, etc., next to commits</w:t>
+            </w:r>
+          </w:p>
+        </w:tc>
+      </w:tr>
+    </w:tbl>
+    <w:p>
+      <w:r>
+        <w:t>Top line represents latest commit</w:t>
+      </w:r>
+    </w:p>
+    <w:p>
+      <w:r>
+        <w:t>Bottom line represents first commit.</w:t>
+      </w:r>
+    </w:p>
+    <w:p>
+      <w:pPr>
+        <w:rPr>
+          <w:b/>
+          <w:bCs/>
+          <w:u w:val="single"/>
+        </w:rPr>
+      </w:pPr>
+      <w:r>
+        <w:rPr>
+          <w:b/>
+          <w:bCs/>
+          <w:u w:val="single"/>
+        </w:rPr>
+        <w:t>The lines show, the commit 2f327… came from another branch</w:t>
+      </w:r>
+    </w:p>
     <w:sectPr>
       <w:pgSz w:w="11906" w:h="16838"/>
       <w:pgMar w:top="1440" w:right="1440" w:bottom="1440" w:left="1440" w:header="708" w:footer="708" w:gutter="0"/>
@@ -926,6 +1959,155 @@
 <file path=word/numbering.xml><?xml version="1.0" encoding="utf-8"?>
 <w:numbering xmlns:wpc="http://schemas.microsoft.com/office/word/2010/wordprocessingCanvas" xmlns:cx="http://schemas.microsoft.com/office/drawing/2014/chartex" xmlns:cx1="http://schemas.microsoft.com/office/drawing/2015/9/8/chartex" xmlns:cx2="http://schemas.microsoft.com/office/drawing/2015/10/21/chartex" xmlns:cx3="http://schemas.microsoft.com/office/drawing/2016/5/9/chartex" xmlns:cx4="http://schemas.microsoft.com/office/drawing/2016/5/10/chartex" xmlns:cx5="http://schemas.microsoft.com/office/drawing/2016/5/11/chartex" xmlns:cx6="http://schemas.microsoft.com/office/drawing/2016/5/12/chartex" xmlns:cx7="http://schemas.microsoft.com/office/drawing/2016/5/13/chartex" xmlns:cx8="http://schemas.microsoft.com/office/drawing/2016/5/14/chartex" xmlns:mc="http://schemas.openxmlformats.org/markup-compatibility/2006" xmlns:aink="http://schemas.microsoft.com/office/drawing/2016/ink" xmlns:am3d="http://schemas.microsoft.com/office/drawing/2017/model3d" xmlns:o="urn:schemas-microsoft-com:office:office" xmlns:oel="http://schemas.microsoft.com/office/2019/extlst" xmlns:r="http://schemas.openxmlformats.org/officeDocument/2006/relationships" xmlns:m="http://schemas.openxmlformats.org/officeDocument/2006/math" xmlns:v="urn:schemas-microsoft-com:vml" xmlns:wp14="http://schemas.microsoft.com/office/word/2010/wordprocessingDrawing" xmlns:wp="http://schemas.openxmlformats.org/drawingml/2006/wordprocessingDrawing" xmlns:w10="urn:schemas-microsoft-com:office:word" xmlns:w="http://schemas.openxmlformats.org/wordprocessingml/2006/main" xmlns:w14="http://schemas.microsoft.com/office/word/2010/wordml" xmlns:w15="http://schemas.microsoft.com/office/word/2012/wordml" xmlns:w16cex="http://schemas.microsoft.com/office/word/2018/wordml/cex" xmlns:w16cid="http://schemas.microsoft.com/office/word/2016/wordml/cid" xmlns:w16="http://schemas.microsoft.com/office/word/2018/wordml" xmlns:w16du="http://schemas.microsoft.com/office/word/2023/wordml/word16du" xmlns:w16sdtdh="http://schemas.microsoft.com/office/word/2020/wordml/sdtdatahash" xmlns:w16sdtfl="http://schemas.microsoft.com/office/word/2024/wordml/sdtformatlock" xmlns:w16se="http://schemas.microsoft.com/office/word/2015/wordml/symex" xmlns:wpg="http://schemas.microsoft.com/office/word/2010/wordprocessingGroup" xmlns:wpi="http://schemas.microsoft.com/office/word/2010/wordprocessingInk" xmlns:wne="http://schemas.microsoft.com/office/word/2006/wordml" xmlns:wps="http://schemas.microsoft.com/office/word/2010/wordprocessingShape" mc:Ignorable="w14 w15 w16se w16cid w16 w16cex w16sdtdh w16sdtfl w16du wp14">
   <w:abstractNum w:abstractNumId="0" w15:restartNumberingAfterBreak="0">
+    <w:nsid w:val="0E2D79BD"/>
+    <w:multiLevelType w:val="multilevel"/>
+    <w:tmpl w:val="41C0D0F4"/>
+    <w:lvl w:ilvl="0">
+      <w:start w:val="1"/>
+      <w:numFmt w:val="bullet"/>
+      <w:lvlText w:val=""/>
+      <w:lvlJc w:val="left"/>
+      <w:pPr>
+        <w:tabs>
+          <w:tab w:val="num" w:pos="720"/>
+        </w:tabs>
+        <w:ind w:left="720" w:hanging="360"/>
+      </w:pPr>
+      <w:rPr>
+        <w:rFonts w:ascii="Symbol" w:hAnsi="Symbol" w:hint="default"/>
+        <w:sz w:val="20"/>
+      </w:rPr>
+    </w:lvl>
+    <w:lvl w:ilvl="1" w:tentative="1">
+      <w:start w:val="1"/>
+      <w:numFmt w:val="bullet"/>
+      <w:lvlText w:val="o"/>
+      <w:lvlJc w:val="left"/>
+      <w:pPr>
+        <w:tabs>
+          <w:tab w:val="num" w:pos="1440"/>
+        </w:tabs>
+        <w:ind w:left="1440" w:hanging="360"/>
+      </w:pPr>
+      <w:rPr>
+        <w:rFonts w:ascii="Courier New" w:hAnsi="Courier New" w:hint="default"/>
+        <w:sz w:val="20"/>
+      </w:rPr>
+    </w:lvl>
+    <w:lvl w:ilvl="2" w:tentative="1">
+      <w:start w:val="1"/>
+      <w:numFmt w:val="bullet"/>
+      <w:lvlText w:val=""/>
+      <w:lvlJc w:val="left"/>
+      <w:pPr>
+        <w:tabs>
+          <w:tab w:val="num" w:pos="2160"/>
+        </w:tabs>
+        <w:ind w:left="2160" w:hanging="360"/>
+      </w:pPr>
+      <w:rPr>
+        <w:rFonts w:ascii="Wingdings" w:hAnsi="Wingdings" w:hint="default"/>
+        <w:sz w:val="20"/>
+      </w:rPr>
+    </w:lvl>
+    <w:lvl w:ilvl="3" w:tentative="1">
+      <w:start w:val="1"/>
+      <w:numFmt w:val="bullet"/>
+      <w:lvlText w:val=""/>
+      <w:lvlJc w:val="left"/>
+      <w:pPr>
+        <w:tabs>
+          <w:tab w:val="num" w:pos="2880"/>
+        </w:tabs>
+        <w:ind w:left="2880" w:hanging="360"/>
+      </w:pPr>
+      <w:rPr>
+        <w:rFonts w:ascii="Wingdings" w:hAnsi="Wingdings" w:hint="default"/>
+        <w:sz w:val="20"/>
+      </w:rPr>
+    </w:lvl>
+    <w:lvl w:ilvl="4" w:tentative="1">
+      <w:start w:val="1"/>
+      <w:numFmt w:val="bullet"/>
+      <w:lvlText w:val=""/>
+      <w:lvlJc w:val="left"/>
+      <w:pPr>
+        <w:tabs>
+          <w:tab w:val="num" w:pos="3600"/>
+        </w:tabs>
+        <w:ind w:left="3600" w:hanging="360"/>
+      </w:pPr>
+      <w:rPr>
+        <w:rFonts w:ascii="Wingdings" w:hAnsi="Wingdings" w:hint="default"/>
+        <w:sz w:val="20"/>
+      </w:rPr>
+    </w:lvl>
+    <w:lvl w:ilvl="5" w:tentative="1">
+      <w:start w:val="1"/>
+      <w:numFmt w:val="bullet"/>
+      <w:lvlText w:val=""/>
+      <w:lvlJc w:val="left"/>
+      <w:pPr>
+        <w:tabs>
+          <w:tab w:val="num" w:pos="4320"/>
+        </w:tabs>
+        <w:ind w:left="4320" w:hanging="360"/>
+      </w:pPr>
+      <w:rPr>
+        <w:rFonts w:ascii="Wingdings" w:hAnsi="Wingdings" w:hint="default"/>
+        <w:sz w:val="20"/>
+      </w:rPr>
+    </w:lvl>
+    <w:lvl w:ilvl="6" w:tentative="1">
+      <w:start w:val="1"/>
+      <w:numFmt w:val="bullet"/>
+      <w:lvlText w:val=""/>
+      <w:lvlJc w:val="left"/>
+      <w:pPr>
+        <w:tabs>
+          <w:tab w:val="num" w:pos="5040"/>
+        </w:tabs>
+        <w:ind w:left="5040" w:hanging="360"/>
+      </w:pPr>
+      <w:rPr>
+        <w:rFonts w:ascii="Wingdings" w:hAnsi="Wingdings" w:hint="default"/>
+        <w:sz w:val="20"/>
+      </w:rPr>
+    </w:lvl>
+    <w:lvl w:ilvl="7" w:tentative="1">
+      <w:start w:val="1"/>
+      <w:numFmt w:val="bullet"/>
+      <w:lvlText w:val=""/>
+      <w:lvlJc w:val="left"/>
+      <w:pPr>
+        <w:tabs>
+          <w:tab w:val="num" w:pos="5760"/>
+        </w:tabs>
+        <w:ind w:left="5760" w:hanging="360"/>
+      </w:pPr>
+      <w:rPr>
+        <w:rFonts w:ascii="Wingdings" w:hAnsi="Wingdings" w:hint="default"/>
+        <w:sz w:val="20"/>
+      </w:rPr>
+    </w:lvl>
+    <w:lvl w:ilvl="8" w:tentative="1">
+      <w:start w:val="1"/>
+      <w:numFmt w:val="bullet"/>
+      <w:lvlText w:val=""/>
+      <w:lvlJc w:val="left"/>
+      <w:pPr>
+        <w:tabs>
+          <w:tab w:val="num" w:pos="6480"/>
+        </w:tabs>
+        <w:ind w:left="6480" w:hanging="360"/>
+      </w:pPr>
+      <w:rPr>
+        <w:rFonts w:ascii="Wingdings" w:hAnsi="Wingdings" w:hint="default"/>
+        <w:sz w:val="20"/>
+      </w:rPr>
+    </w:lvl>
+  </w:abstractNum>
+  <w:abstractNum w:abstractNumId="1" w15:restartNumberingAfterBreak="0">
     <w:nsid w:val="13892A55"/>
     <w:multiLevelType w:val="hybridMultilevel"/>
     <w:tmpl w:val="39142E96"/>
@@ -1014,7 +2196,156 @@
       </w:pPr>
     </w:lvl>
   </w:abstractNum>
-  <w:abstractNum w:abstractNumId="1" w15:restartNumberingAfterBreak="0">
+  <w:abstractNum w:abstractNumId="2" w15:restartNumberingAfterBreak="0">
+    <w:nsid w:val="1E8E66F3"/>
+    <w:multiLevelType w:val="multilevel"/>
+    <w:tmpl w:val="8E8E6DF8"/>
+    <w:lvl w:ilvl="0">
+      <w:start w:val="1"/>
+      <w:numFmt w:val="bullet"/>
+      <w:lvlText w:val=""/>
+      <w:lvlJc w:val="left"/>
+      <w:pPr>
+        <w:tabs>
+          <w:tab w:val="num" w:pos="720"/>
+        </w:tabs>
+        <w:ind w:left="720" w:hanging="360"/>
+      </w:pPr>
+      <w:rPr>
+        <w:rFonts w:ascii="Symbol" w:hAnsi="Symbol" w:hint="default"/>
+        <w:sz w:val="20"/>
+      </w:rPr>
+    </w:lvl>
+    <w:lvl w:ilvl="1">
+      <w:start w:val="1"/>
+      <w:numFmt w:val="bullet"/>
+      <w:lvlText w:val="o"/>
+      <w:lvlJc w:val="left"/>
+      <w:pPr>
+        <w:tabs>
+          <w:tab w:val="num" w:pos="1440"/>
+        </w:tabs>
+        <w:ind w:left="1440" w:hanging="360"/>
+      </w:pPr>
+      <w:rPr>
+        <w:rFonts w:ascii="Courier New" w:hAnsi="Courier New" w:hint="default"/>
+        <w:sz w:val="20"/>
+      </w:rPr>
+    </w:lvl>
+    <w:lvl w:ilvl="2" w:tentative="1">
+      <w:start w:val="1"/>
+      <w:numFmt w:val="bullet"/>
+      <w:lvlText w:val=""/>
+      <w:lvlJc w:val="left"/>
+      <w:pPr>
+        <w:tabs>
+          <w:tab w:val="num" w:pos="2160"/>
+        </w:tabs>
+        <w:ind w:left="2160" w:hanging="360"/>
+      </w:pPr>
+      <w:rPr>
+        <w:rFonts w:ascii="Wingdings" w:hAnsi="Wingdings" w:hint="default"/>
+        <w:sz w:val="20"/>
+      </w:rPr>
+    </w:lvl>
+    <w:lvl w:ilvl="3" w:tentative="1">
+      <w:start w:val="1"/>
+      <w:numFmt w:val="bullet"/>
+      <w:lvlText w:val=""/>
+      <w:lvlJc w:val="left"/>
+      <w:pPr>
+        <w:tabs>
+          <w:tab w:val="num" w:pos="2880"/>
+        </w:tabs>
+        <w:ind w:left="2880" w:hanging="360"/>
+      </w:pPr>
+      <w:rPr>
+        <w:rFonts w:ascii="Wingdings" w:hAnsi="Wingdings" w:hint="default"/>
+        <w:sz w:val="20"/>
+      </w:rPr>
+    </w:lvl>
+    <w:lvl w:ilvl="4" w:tentative="1">
+      <w:start w:val="1"/>
+      <w:numFmt w:val="bullet"/>
+      <w:lvlText w:val=""/>
+      <w:lvlJc w:val="left"/>
+      <w:pPr>
+        <w:tabs>
+          <w:tab w:val="num" w:pos="3600"/>
+        </w:tabs>
+        <w:ind w:left="3600" w:hanging="360"/>
+      </w:pPr>
+      <w:rPr>
+        <w:rFonts w:ascii="Wingdings" w:hAnsi="Wingdings" w:hint="default"/>
+        <w:sz w:val="20"/>
+      </w:rPr>
+    </w:lvl>
+    <w:lvl w:ilvl="5" w:tentative="1">
+      <w:start w:val="1"/>
+      <w:numFmt w:val="bullet"/>
+      <w:lvlText w:val=""/>
+      <w:lvlJc w:val="left"/>
+      <w:pPr>
+        <w:tabs>
+          <w:tab w:val="num" w:pos="4320"/>
+        </w:tabs>
+        <w:ind w:left="4320" w:hanging="360"/>
+      </w:pPr>
+      <w:rPr>
+        <w:rFonts w:ascii="Wingdings" w:hAnsi="Wingdings" w:hint="default"/>
+        <w:sz w:val="20"/>
+      </w:rPr>
+    </w:lvl>
+    <w:lvl w:ilvl="6" w:tentative="1">
+      <w:start w:val="1"/>
+      <w:numFmt w:val="bullet"/>
+      <w:lvlText w:val=""/>
+      <w:lvlJc w:val="left"/>
+      <w:pPr>
+        <w:tabs>
+          <w:tab w:val="num" w:pos="5040"/>
+        </w:tabs>
+        <w:ind w:left="5040" w:hanging="360"/>
+      </w:pPr>
+      <w:rPr>
+        <w:rFonts w:ascii="Wingdings" w:hAnsi="Wingdings" w:hint="default"/>
+        <w:sz w:val="20"/>
+      </w:rPr>
+    </w:lvl>
+    <w:lvl w:ilvl="7" w:tentative="1">
+      <w:start w:val="1"/>
+      <w:numFmt w:val="bullet"/>
+      <w:lvlText w:val=""/>
+      <w:lvlJc w:val="left"/>
+      <w:pPr>
+        <w:tabs>
+          <w:tab w:val="num" w:pos="5760"/>
+        </w:tabs>
+        <w:ind w:left="5760" w:hanging="360"/>
+      </w:pPr>
+      <w:rPr>
+        <w:rFonts w:ascii="Wingdings" w:hAnsi="Wingdings" w:hint="default"/>
+        <w:sz w:val="20"/>
+      </w:rPr>
+    </w:lvl>
+    <w:lvl w:ilvl="8" w:tentative="1">
+      <w:start w:val="1"/>
+      <w:numFmt w:val="bullet"/>
+      <w:lvlText w:val=""/>
+      <w:lvlJc w:val="left"/>
+      <w:pPr>
+        <w:tabs>
+          <w:tab w:val="num" w:pos="6480"/>
+        </w:tabs>
+        <w:ind w:left="6480" w:hanging="360"/>
+      </w:pPr>
+      <w:rPr>
+        <w:rFonts w:ascii="Wingdings" w:hAnsi="Wingdings" w:hint="default"/>
+        <w:sz w:val="20"/>
+      </w:rPr>
+    </w:lvl>
+  </w:abstractNum>
+  <w:abstractNum w:abstractNumId="3" w15:restartNumberingAfterBreak="0">
     <w:nsid w:val="28591CAD"/>
     <w:multiLevelType w:val="hybridMultilevel"/>
     <w:tmpl w:val="8D880216"/>
@@ -1127,11 +2458,505 @@
       </w:rPr>
     </w:lvl>
   </w:abstractNum>
+  <w:abstractNum w:abstractNumId="4" w15:restartNumberingAfterBreak="0">
+    <w:nsid w:val="745F40A8"/>
+    <w:multiLevelType w:val="multilevel"/>
+    <w:tmpl w:val="6292DF7C"/>
+    <w:lvl w:ilvl="0">
+      <w:start w:val="1"/>
+      <w:numFmt w:val="bullet"/>
+      <w:lvlText w:val=""/>
+      <w:lvlJc w:val="left"/>
+      <w:pPr>
+        <w:tabs>
+          <w:tab w:val="num" w:pos="720"/>
+        </w:tabs>
+        <w:ind w:left="720" w:hanging="360"/>
+      </w:pPr>
+      <w:rPr>
+        <w:rFonts w:ascii="Symbol" w:hAnsi="Symbol" w:hint="default"/>
+        <w:sz w:val="20"/>
+      </w:rPr>
+    </w:lvl>
+    <w:lvl w:ilvl="1" w:tentative="1">
+      <w:start w:val="1"/>
+      <w:numFmt w:val="bullet"/>
+      <w:lvlText w:val="o"/>
+      <w:lvlJc w:val="left"/>
+      <w:pPr>
+        <w:tabs>
+          <w:tab w:val="num" w:pos="1440"/>
+        </w:tabs>
+        <w:ind w:left="1440" w:hanging="360"/>
+      </w:pPr>
+      <w:rPr>
+        <w:rFonts w:ascii="Courier New" w:hAnsi="Courier New" w:hint="default"/>
+        <w:sz w:val="20"/>
+      </w:rPr>
+    </w:lvl>
+    <w:lvl w:ilvl="2" w:tentative="1">
+      <w:start w:val="1"/>
+      <w:numFmt w:val="bullet"/>
+      <w:lvlText w:val=""/>
+      <w:lvlJc w:val="left"/>
+      <w:pPr>
+        <w:tabs>
+          <w:tab w:val="num" w:pos="2160"/>
+        </w:tabs>
+        <w:ind w:left="2160" w:hanging="360"/>
+      </w:pPr>
+      <w:rPr>
+        <w:rFonts w:ascii="Wingdings" w:hAnsi="Wingdings" w:hint="default"/>
+        <w:sz w:val="20"/>
+      </w:rPr>
+    </w:lvl>
+    <w:lvl w:ilvl="3" w:tentative="1">
+      <w:start w:val="1"/>
+      <w:numFmt w:val="bullet"/>
+      <w:lvlText w:val=""/>
+      <w:lvlJc w:val="left"/>
+      <w:pPr>
+        <w:tabs>
+          <w:tab w:val="num" w:pos="2880"/>
+        </w:tabs>
+        <w:ind w:left="2880" w:hanging="360"/>
+      </w:pPr>
+      <w:rPr>
+        <w:rFonts w:ascii="Wingdings" w:hAnsi="Wingdings" w:hint="default"/>
+        <w:sz w:val="20"/>
+      </w:rPr>
+    </w:lvl>
+    <w:lvl w:ilvl="4" w:tentative="1">
+      <w:start w:val="1"/>
+      <w:numFmt w:val="bullet"/>
+      <w:lvlText w:val=""/>
+      <w:lvlJc w:val="left"/>
+      <w:pPr>
+        <w:tabs>
+          <w:tab w:val="num" w:pos="3600"/>
+        </w:tabs>
+        <w:ind w:left="3600" w:hanging="360"/>
+      </w:pPr>
+      <w:rPr>
+        <w:rFonts w:ascii="Wingdings" w:hAnsi="Wingdings" w:hint="default"/>
+        <w:sz w:val="20"/>
+      </w:rPr>
+    </w:lvl>
+    <w:lvl w:ilvl="5" w:tentative="1">
+      <w:start w:val="1"/>
+      <w:numFmt w:val="bullet"/>
+      <w:lvlText w:val=""/>
+      <w:lvlJc w:val="left"/>
+      <w:pPr>
+        <w:tabs>
+          <w:tab w:val="num" w:pos="4320"/>
+        </w:tabs>
+        <w:ind w:left="4320" w:hanging="360"/>
+      </w:pPr>
+      <w:rPr>
+        <w:rFonts w:ascii="Wingdings" w:hAnsi="Wingdings" w:hint="default"/>
+        <w:sz w:val="20"/>
+      </w:rPr>
+    </w:lvl>
+    <w:lvl w:ilvl="6" w:tentative="1">
+      <w:start w:val="1"/>
+      <w:numFmt w:val="bullet"/>
+      <w:lvlText w:val=""/>
+      <w:lvlJc w:val="left"/>
+      <w:pPr>
+        <w:tabs>
+          <w:tab w:val="num" w:pos="5040"/>
+        </w:tabs>
+        <w:ind w:left="5040" w:hanging="360"/>
+      </w:pPr>
+      <w:rPr>
+        <w:rFonts w:ascii="Wingdings" w:hAnsi="Wingdings" w:hint="default"/>
+        <w:sz w:val="20"/>
+      </w:rPr>
+    </w:lvl>
+    <w:lvl w:ilvl="7" w:tentative="1">
+      <w:start w:val="1"/>
+      <w:numFmt w:val="bullet"/>
+      <w:lvlText w:val=""/>
+      <w:lvlJc w:val="left"/>
+      <w:pPr>
+        <w:tabs>
+          <w:tab w:val="num" w:pos="5760"/>
+        </w:tabs>
+        <w:ind w:left="5760" w:hanging="360"/>
+      </w:pPr>
+      <w:rPr>
+        <w:rFonts w:ascii="Wingdings" w:hAnsi="Wingdings" w:hint="default"/>
+        <w:sz w:val="20"/>
+      </w:rPr>
+    </w:lvl>
+    <w:lvl w:ilvl="8" w:tentative="1">
+      <w:start w:val="1"/>
+      <w:numFmt w:val="bullet"/>
+      <w:lvlText w:val=""/>
+      <w:lvlJc w:val="left"/>
+      <w:pPr>
+        <w:tabs>
+          <w:tab w:val="num" w:pos="6480"/>
+        </w:tabs>
+        <w:ind w:left="6480" w:hanging="360"/>
+      </w:pPr>
+      <w:rPr>
+        <w:rFonts w:ascii="Wingdings" w:hAnsi="Wingdings" w:hint="default"/>
+        <w:sz w:val="20"/>
+      </w:rPr>
+    </w:lvl>
+  </w:abstractNum>
+  <w:abstractNum w:abstractNumId="5" w15:restartNumberingAfterBreak="0">
+    <w:nsid w:val="77A13144"/>
+    <w:multiLevelType w:val="hybridMultilevel"/>
+    <w:tmpl w:val="EE4A2CA4"/>
+    <w:lvl w:ilvl="0" w:tplc="4009000F">
+      <w:start w:val="1"/>
+      <w:numFmt w:val="decimal"/>
+      <w:lvlText w:val="%1."/>
+      <w:lvlJc w:val="left"/>
+      <w:pPr>
+        <w:ind w:left="720" w:hanging="360"/>
+      </w:pPr>
+      <w:rPr>
+        <w:rFonts w:hint="default"/>
+      </w:rPr>
+    </w:lvl>
+    <w:lvl w:ilvl="1" w:tplc="40090019">
+      <w:start w:val="1"/>
+      <w:numFmt w:val="lowerLetter"/>
+      <w:lvlText w:val="%2."/>
+      <w:lvlJc w:val="left"/>
+      <w:pPr>
+        <w:ind w:left="1440" w:hanging="360"/>
+      </w:pPr>
+    </w:lvl>
+    <w:lvl w:ilvl="2" w:tplc="4009001B" w:tentative="1">
+      <w:start w:val="1"/>
+      <w:numFmt w:val="lowerRoman"/>
+      <w:lvlText w:val="%3."/>
+      <w:lvlJc w:val="right"/>
+      <w:pPr>
+        <w:ind w:left="2160" w:hanging="180"/>
+      </w:pPr>
+    </w:lvl>
+    <w:lvl w:ilvl="3" w:tplc="4009000F" w:tentative="1">
+      <w:start w:val="1"/>
+      <w:numFmt w:val="decimal"/>
+      <w:lvlText w:val="%4."/>
+      <w:lvlJc w:val="left"/>
+      <w:pPr>
+        <w:ind w:left="2880" w:hanging="360"/>
+      </w:pPr>
+    </w:lvl>
+    <w:lvl w:ilvl="4" w:tplc="40090019" w:tentative="1">
+      <w:start w:val="1"/>
+      <w:numFmt w:val="lowerLetter"/>
+      <w:lvlText w:val="%5."/>
+      <w:lvlJc w:val="left"/>
+      <w:pPr>
+        <w:ind w:left="3600" w:hanging="360"/>
+      </w:pPr>
+    </w:lvl>
+    <w:lvl w:ilvl="5" w:tplc="4009001B" w:tentative="1">
+      <w:start w:val="1"/>
+      <w:numFmt w:val="lowerRoman"/>
+      <w:lvlText w:val="%6."/>
+      <w:lvlJc w:val="right"/>
+      <w:pPr>
+        <w:ind w:left="4320" w:hanging="180"/>
+      </w:pPr>
+    </w:lvl>
+    <w:lvl w:ilvl="6" w:tplc="4009000F" w:tentative="1">
+      <w:start w:val="1"/>
+      <w:numFmt w:val="decimal"/>
+      <w:lvlText w:val="%7."/>
+      <w:lvlJc w:val="left"/>
+      <w:pPr>
+        <w:ind w:left="5040" w:hanging="360"/>
+      </w:pPr>
+    </w:lvl>
+    <w:lvl w:ilvl="7" w:tplc="40090019" w:tentative="1">
+      <w:start w:val="1"/>
+      <w:numFmt w:val="lowerLetter"/>
+      <w:lvlText w:val="%8."/>
+      <w:lvlJc w:val="left"/>
+      <w:pPr>
+        <w:ind w:left="5760" w:hanging="360"/>
+      </w:pPr>
+    </w:lvl>
+    <w:lvl w:ilvl="8" w:tplc="4009001B" w:tentative="1">
+      <w:start w:val="1"/>
+      <w:numFmt w:val="lowerRoman"/>
+      <w:lvlText w:val="%9."/>
+      <w:lvlJc w:val="right"/>
+      <w:pPr>
+        <w:ind w:left="6480" w:hanging="180"/>
+      </w:pPr>
+    </w:lvl>
+  </w:abstractNum>
+  <w:abstractNum w:abstractNumId="6" w15:restartNumberingAfterBreak="0">
+    <w:nsid w:val="77F42D33"/>
+    <w:multiLevelType w:val="hybridMultilevel"/>
+    <w:tmpl w:val="5DDC312E"/>
+    <w:lvl w:ilvl="0" w:tplc="DB00274E">
+      <w:start w:val="1"/>
+      <w:numFmt w:val="decimal"/>
+      <w:lvlText w:val="%1."/>
+      <w:lvlJc w:val="left"/>
+      <w:pPr>
+        <w:ind w:left="1440" w:hanging="360"/>
+      </w:pPr>
+      <w:rPr>
+        <w:rFonts w:hint="default"/>
+      </w:rPr>
+    </w:lvl>
+    <w:lvl w:ilvl="1" w:tplc="40090019">
+      <w:start w:val="1"/>
+      <w:numFmt w:val="lowerLetter"/>
+      <w:lvlText w:val="%2."/>
+      <w:lvlJc w:val="left"/>
+      <w:pPr>
+        <w:ind w:left="2160" w:hanging="360"/>
+      </w:pPr>
+    </w:lvl>
+    <w:lvl w:ilvl="2" w:tplc="4009001B">
+      <w:start w:val="1"/>
+      <w:numFmt w:val="lowerRoman"/>
+      <w:lvlText w:val="%3."/>
+      <w:lvlJc w:val="right"/>
+      <w:pPr>
+        <w:ind w:left="2880" w:hanging="180"/>
+      </w:pPr>
+    </w:lvl>
+    <w:lvl w:ilvl="3" w:tplc="4009000F" w:tentative="1">
+      <w:start w:val="1"/>
+      <w:numFmt w:val="decimal"/>
+      <w:lvlText w:val="%4."/>
+      <w:lvlJc w:val="left"/>
+      <w:pPr>
+        <w:ind w:left="3600" w:hanging="360"/>
+      </w:pPr>
+    </w:lvl>
+    <w:lvl w:ilvl="4" w:tplc="40090019" w:tentative="1">
+      <w:start w:val="1"/>
+      <w:numFmt w:val="lowerLetter"/>
+      <w:lvlText w:val="%5."/>
+      <w:lvlJc w:val="left"/>
+      <w:pPr>
+        <w:ind w:left="4320" w:hanging="360"/>
+      </w:pPr>
+    </w:lvl>
+    <w:lvl w:ilvl="5" w:tplc="4009001B" w:tentative="1">
+      <w:start w:val="1"/>
+      <w:numFmt w:val="lowerRoman"/>
+      <w:lvlText w:val="%6."/>
+      <w:lvlJc w:val="right"/>
+      <w:pPr>
+        <w:ind w:left="5040" w:hanging="180"/>
+      </w:pPr>
+    </w:lvl>
+    <w:lvl w:ilvl="6" w:tplc="4009000F" w:tentative="1">
+      <w:start w:val="1"/>
+      <w:numFmt w:val="decimal"/>
+      <w:lvlText w:val="%7."/>
+      <w:lvlJc w:val="left"/>
+      <w:pPr>
+        <w:ind w:left="5760" w:hanging="360"/>
+      </w:pPr>
+    </w:lvl>
+    <w:lvl w:ilvl="7" w:tplc="40090019" w:tentative="1">
+      <w:start w:val="1"/>
+      <w:numFmt w:val="lowerLetter"/>
+      <w:lvlText w:val="%8."/>
+      <w:lvlJc w:val="left"/>
+      <w:pPr>
+        <w:ind w:left="6480" w:hanging="360"/>
+      </w:pPr>
+    </w:lvl>
+    <w:lvl w:ilvl="8" w:tplc="4009001B" w:tentative="1">
+      <w:start w:val="1"/>
+      <w:numFmt w:val="lowerRoman"/>
+      <w:lvlText w:val="%9."/>
+      <w:lvlJc w:val="right"/>
+      <w:pPr>
+        <w:ind w:left="7200" w:hanging="180"/>
+      </w:pPr>
+    </w:lvl>
+  </w:abstractNum>
+  <w:abstractNum w:abstractNumId="7" w15:restartNumberingAfterBreak="0">
+    <w:nsid w:val="79AD2C50"/>
+    <w:multiLevelType w:val="multilevel"/>
+    <w:tmpl w:val="5F246AA2"/>
+    <w:lvl w:ilvl="0">
+      <w:start w:val="1"/>
+      <w:numFmt w:val="bullet"/>
+      <w:lvlText w:val=""/>
+      <w:lvlJc w:val="left"/>
+      <w:pPr>
+        <w:tabs>
+          <w:tab w:val="num" w:pos="720"/>
+        </w:tabs>
+        <w:ind w:left="720" w:hanging="360"/>
+      </w:pPr>
+      <w:rPr>
+        <w:rFonts w:ascii="Symbol" w:hAnsi="Symbol" w:hint="default"/>
+        <w:sz w:val="20"/>
+      </w:rPr>
+    </w:lvl>
+    <w:lvl w:ilvl="1" w:tentative="1">
+      <w:start w:val="1"/>
+      <w:numFmt w:val="bullet"/>
+      <w:lvlText w:val="o"/>
+      <w:lvlJc w:val="left"/>
+      <w:pPr>
+        <w:tabs>
+          <w:tab w:val="num" w:pos="1440"/>
+        </w:tabs>
+        <w:ind w:left="1440" w:hanging="360"/>
+      </w:pPr>
+      <w:rPr>
+        <w:rFonts w:ascii="Courier New" w:hAnsi="Courier New" w:hint="default"/>
+        <w:sz w:val="20"/>
+      </w:rPr>
+    </w:lvl>
+    <w:lvl w:ilvl="2" w:tentative="1">
+      <w:start w:val="1"/>
+      <w:numFmt w:val="bullet"/>
+      <w:lvlText w:val=""/>
+      <w:lvlJc w:val="left"/>
+      <w:pPr>
+        <w:tabs>
+          <w:tab w:val="num" w:pos="2160"/>
+        </w:tabs>
+        <w:ind w:left="2160" w:hanging="360"/>
+      </w:pPr>
+      <w:rPr>
+        <w:rFonts w:ascii="Wingdings" w:hAnsi="Wingdings" w:hint="default"/>
+        <w:sz w:val="20"/>
+      </w:rPr>
+    </w:lvl>
+    <w:lvl w:ilvl="3" w:tentative="1">
+      <w:start w:val="1"/>
+      <w:numFmt w:val="bullet"/>
+      <w:lvlText w:val=""/>
+      <w:lvlJc w:val="left"/>
+      <w:pPr>
+        <w:tabs>
+          <w:tab w:val="num" w:pos="2880"/>
+        </w:tabs>
+        <w:ind w:left="2880" w:hanging="360"/>
+      </w:pPr>
+      <w:rPr>
+        <w:rFonts w:ascii="Wingdings" w:hAnsi="Wingdings" w:hint="default"/>
+        <w:sz w:val="20"/>
+      </w:rPr>
+    </w:lvl>
+    <w:lvl w:ilvl="4" w:tentative="1">
+      <w:start w:val="1"/>
+      <w:numFmt w:val="bullet"/>
+      <w:lvlText w:val=""/>
+      <w:lvlJc w:val="left"/>
+      <w:pPr>
+        <w:tabs>
+          <w:tab w:val="num" w:pos="3600"/>
+        </w:tabs>
+        <w:ind w:left="3600" w:hanging="360"/>
+      </w:pPr>
+      <w:rPr>
+        <w:rFonts w:ascii="Wingdings" w:hAnsi="Wingdings" w:hint="default"/>
+        <w:sz w:val="20"/>
+      </w:rPr>
+    </w:lvl>
+    <w:lvl w:ilvl="5" w:tentative="1">
+      <w:start w:val="1"/>
+      <w:numFmt w:val="bullet"/>
+      <w:lvlText w:val=""/>
+      <w:lvlJc w:val="left"/>
+      <w:pPr>
+        <w:tabs>
+          <w:tab w:val="num" w:pos="4320"/>
+        </w:tabs>
+        <w:ind w:left="4320" w:hanging="360"/>
+      </w:pPr>
+      <w:rPr>
+        <w:rFonts w:ascii="Wingdings" w:hAnsi="Wingdings" w:hint="default"/>
+        <w:sz w:val="20"/>
+      </w:rPr>
+    </w:lvl>
+    <w:lvl w:ilvl="6" w:tentative="1">
+      <w:start w:val="1"/>
+      <w:numFmt w:val="bullet"/>
+      <w:lvlText w:val=""/>
+      <w:lvlJc w:val="left"/>
+      <w:pPr>
+        <w:tabs>
+          <w:tab w:val="num" w:pos="5040"/>
+        </w:tabs>
+        <w:ind w:left="5040" w:hanging="360"/>
+      </w:pPr>
+      <w:rPr>
+        <w:rFonts w:ascii="Wingdings" w:hAnsi="Wingdings" w:hint="default"/>
+        <w:sz w:val="20"/>
+      </w:rPr>
+    </w:lvl>
+    <w:lvl w:ilvl="7" w:tentative="1">
+      <w:start w:val="1"/>
+      <w:numFmt w:val="bullet"/>
+      <w:lvlText w:val=""/>
+      <w:lvlJc w:val="left"/>
+      <w:pPr>
+        <w:tabs>
+          <w:tab w:val="num" w:pos="5760"/>
+        </w:tabs>
+        <w:ind w:left="5760" w:hanging="360"/>
+      </w:pPr>
+      <w:rPr>
+        <w:rFonts w:ascii="Wingdings" w:hAnsi="Wingdings" w:hint="default"/>
+        <w:sz w:val="20"/>
+      </w:rPr>
+    </w:lvl>
+    <w:lvl w:ilvl="8" w:tentative="1">
+      <w:start w:val="1"/>
+      <w:numFmt w:val="bullet"/>
+      <w:lvlText w:val=""/>
+      <w:lvlJc w:val="left"/>
+      <w:pPr>
+        <w:tabs>
+          <w:tab w:val="num" w:pos="6480"/>
+        </w:tabs>
+        <w:ind w:left="6480" w:hanging="360"/>
+      </w:pPr>
+      <w:rPr>
+        <w:rFonts w:ascii="Wingdings" w:hAnsi="Wingdings" w:hint="default"/>
+        <w:sz w:val="20"/>
+      </w:rPr>
+    </w:lvl>
+  </w:abstractNum>
   <w:num w:numId="1" w16cid:durableId="1849833252">
+    <w:abstractNumId w:val="1"/>
+  </w:num>
+  <w:num w:numId="2" w16cid:durableId="1789083526">
+    <w:abstractNumId w:val="3"/>
+  </w:num>
+  <w:num w:numId="3" w16cid:durableId="165025802">
+    <w:abstractNumId w:val="5"/>
+  </w:num>
+  <w:num w:numId="4" w16cid:durableId="561062953">
+    <w:abstractNumId w:val="4"/>
+  </w:num>
+  <w:num w:numId="5" w16cid:durableId="713194793">
+    <w:abstractNumId w:val="7"/>
+  </w:num>
+  <w:num w:numId="6" w16cid:durableId="72431672">
+    <w:abstractNumId w:val="6"/>
+  </w:num>
+  <w:num w:numId="7" w16cid:durableId="1764691122">
     <w:abstractNumId w:val="0"/>
   </w:num>
-  <w:num w:numId="2" w16cid:durableId="1789083526">
-    <w:abstractNumId w:val="1"/>
+  <w:num w:numId="8" w16cid:durableId="792483414">
+    <w:abstractNumId w:val="2"/>
   </w:num>
 </w:numbering>
 </file>
@@ -1610,7 +3435,6 @@
     <w:next w:val="Normal"/>
     <w:link w:val="Heading4Char"/>
     <w:uiPriority w:val="9"/>
-    <w:semiHidden/>
     <w:unhideWhenUsed/>
     <w:qFormat/>
     <w:rsid w:val="00817D94"/>
@@ -1739,7 +3563,6 @@
   <w:style w:type="character" w:default="1" w:styleId="DefaultParagraphFont">
     <w:name w:val="Default Paragraph Font"/>
     <w:uiPriority w:val="1"/>
-    <w:semiHidden/>
     <w:unhideWhenUsed/>
   </w:style>
   <w:style w:type="table" w:default="1" w:styleId="TableNormal">
@@ -1809,7 +3632,6 @@
     <w:basedOn w:val="DefaultParagraphFont"/>
     <w:link w:val="Heading4"/>
     <w:uiPriority w:val="9"/>
-    <w:semiHidden/>
     <w:rsid w:val="00817D94"/>
     <w:rPr>
       <w:rFonts w:eastAsiaTheme="majorEastAsia" w:cstheme="majorBidi"/>
@@ -2051,6 +3873,41 @@
       <w:smallCaps/>
       <w:color w:val="2F5496" w:themeColor="accent1" w:themeShade="BF"/>
       <w:spacing w:val="5"/>
+    </w:rPr>
+  </w:style>
+  <w:style w:type="paragraph" w:styleId="NormalWeb">
+    <w:name w:val="Normal (Web)"/>
+    <w:basedOn w:val="Normal"/>
+    <w:uiPriority w:val="99"/>
+    <w:semiHidden/>
+    <w:unhideWhenUsed/>
+    <w:rsid w:val="002F6AE2"/>
+    <w:rPr>
+      <w:rFonts w:ascii="Times New Roman" w:hAnsi="Times New Roman" w:cs="Times New Roman"/>
+    </w:rPr>
+  </w:style>
+  <w:style w:type="character" w:styleId="HTMLCode">
+    <w:name w:val="HTML Code"/>
+    <w:basedOn w:val="DefaultParagraphFont"/>
+    <w:uiPriority w:val="99"/>
+    <w:semiHidden/>
+    <w:unhideWhenUsed/>
+    <w:rsid w:val="002F6AE2"/>
+    <w:rPr>
+      <w:rFonts w:ascii="Courier New" w:eastAsia="Times New Roman" w:hAnsi="Courier New" w:cs="Courier New"/>
+      <w:sz w:val="20"/>
+      <w:szCs w:val="20"/>
+    </w:rPr>
+  </w:style>
+  <w:style w:type="character" w:styleId="Strong">
+    <w:name w:val="Strong"/>
+    <w:basedOn w:val="DefaultParagraphFont"/>
+    <w:uiPriority w:val="22"/>
+    <w:qFormat/>
+    <w:rsid w:val="002F6AE2"/>
+    <w:rPr>
+      <w:b/>
+      <w:bCs/>
     </w:rPr>
   </w:style>
 </w:styles>
@@ -2349,4 +4206,16 @@
     </a:ext>
   </a:extLst>
 </a:theme>
+</file>
+
+<file path=customXml/item1.xml><?xml version="1.0" encoding="utf-8"?>
+<b:Sources xmlns:b="http://schemas.openxmlformats.org/officeDocument/2006/bibliography" xmlns="http://schemas.openxmlformats.org/officeDocument/2006/bibliography" SelectedStyle="\APASixthEditionOfficeOnline.xsl" StyleName="APA" Version="6"/>
+</file>
+
+<file path=customXml/itemProps1.xml><?xml version="1.0" encoding="utf-8"?>
+<ds:datastoreItem xmlns:ds="http://schemas.openxmlformats.org/officeDocument/2006/customXml" ds:itemID="{D35D5484-3361-4777-936B-2E2DEF8D1F90}">
+  <ds:schemaRefs>
+    <ds:schemaRef ds:uri="http://schemas.openxmlformats.org/officeDocument/2006/bibliography"/>
+  </ds:schemaRefs>
+</ds:datastoreItem>
 </file>
</xml_diff>